<commit_message>
N4: trabajo futuro con el equipo perimetral, sin atarlo a pfSense
</commit_message>
<xml_diff>
--- a/03-entregables/13-respuesta-observaciones-validacion-interna/Articulo-IJIES-espanol_MARK_observaciones-aplicadas.docx
+++ b/03-entregables/13-respuesta-observaciones-validacion-interna/Articulo-IJIES-espanol_MARK_observaciones-aplicadas.docx
@@ -17608,7 +17608,7 @@
             <w:color w:val="000000" w:themeColor="text1"/>
             <w:lang w:val="es-PE"/>
           </w:rPr>
-          <w:t xml:space="preserve">Como trabajo futuro se plantea incorporar IPv6, lo que requiere construir una nueva línea base y recalibrar el umbral; extender la aplicación de la respuesta a un agente en el router perimetral pfSense, complementario a los agentes de los hosts; y evaluar el sistema con ataques no utilizados durante su desarrollo, sobre un conjunto de prueba reservado.</w:t>
+          <w:t xml:space="preserve">Como trabajo futuro se plantea incorporar IPv6, lo que requiere construir una nueva línea base y recalibrar el umbral; integrar la respuesta con el equipo perimetral de la red, de modo que una detección genere automáticamente la regla correspondiente en él, de forma complementaria a los agentes de los hosts; y evaluar el sistema con ataques no utilizados durante su desarrollo, sobre un conjunto de prueba reservado.</w:t>
         </w:r>
       </w:ins>
     </w:p>
@@ -18600,7 +18600,7 @@
 
 <file path=word/comments.xml><?xml version="1.0" encoding="utf-8"?>
 <w:comments xmlns:wpc="http://schemas.microsoft.com/office/word/2010/wordprocessingCanvas" xmlns:cx="http://schemas.microsoft.com/office/drawing/2014/chartex" xmlns:cx1="http://schemas.microsoft.com/office/drawing/2015/9/8/chartex" xmlns:cx2="http://schemas.microsoft.com/office/drawing/2015/10/21/chartex" xmlns:cx3="http://schemas.microsoft.com/office/drawing/2016/5/9/chartex" xmlns:cx4="http://schemas.microsoft.com/office/drawing/2016/5/10/chartex" xmlns:cx5="http://schemas.microsoft.com/office/drawing/2016/5/11/chartex" xmlns:cx6="http://schemas.microsoft.com/office/drawing/2016/5/12/chartex" xmlns:cx7="http://schemas.microsoft.com/office/drawing/2016/5/13/chartex" xmlns:cx8="http://schemas.microsoft.com/office/drawing/2016/5/14/chartex" xmlns:mc="http://schemas.openxmlformats.org/markup-compatibility/2006" xmlns:aink="http://schemas.microsoft.com/office/drawing/2016/ink" xmlns:am3d="http://schemas.microsoft.com/office/drawing/2017/model3d" xmlns:o="urn:schemas-microsoft-com:office:office" xmlns:oel="http://schemas.microsoft.com/office/2019/extlst" xmlns:r="http://schemas.openxmlformats.org/officeDocument/2006/relationships" xmlns:m="http://schemas.openxmlformats.org/officeDocument/2006/math" xmlns:v="urn:schemas-microsoft-com:vml" xmlns:wp14="http://schemas.microsoft.com/office/word/2010/wordprocessingDrawing" xmlns:wp="http://schemas.openxmlformats.org/drawingml/2006/wordprocessingDrawing" xmlns:w10="urn:schemas-microsoft-com:office:word" xmlns:w="http://schemas.openxmlformats.org/wordprocessingml/2006/main" xmlns:w14="http://schemas.microsoft.com/office/word/2010/wordml" xmlns:w15="http://schemas.microsoft.com/office/word/2012/wordml" xmlns:w16cex="http://schemas.microsoft.com/office/word/2018/wordml/cex" xmlns:w16cid="http://schemas.microsoft.com/office/word/2016/wordml/cid" xmlns:w16="http://schemas.microsoft.com/office/word/2018/wordml" xmlns:w16du="http://schemas.microsoft.com/office/word/2023/wordml/word16du" xmlns:w16sdtdh="http://schemas.microsoft.com/office/word/2020/wordml/sdtdatahash" xmlns:w16sdtfl="http://schemas.microsoft.com/office/word/2024/wordml/sdtformatlock" xmlns:w16se="http://schemas.microsoft.com/office/word/2015/wordml/symex" xmlns:wpg="http://schemas.microsoft.com/office/word/2010/wordprocessingGroup" xmlns:wpi="http://schemas.microsoft.com/office/word/2010/wordprocessingInk" xmlns:wne="http://schemas.microsoft.com/office/word/2006/wordml" xmlns:wps="http://schemas.microsoft.com/office/word/2010/wordprocessingShape" mc:Ignorable="w14 w15 w16se w16cid w16 w16cex w16sdtdh w16sdtfl w16du wp14">
-  <w:comment w:id="0" w:author="Claude" w:date="2026-10-23T22:44:34Z" w:initials="CL">
+  <w:comment w:id="0" w:author="Claude" w:date="2026-10-23T22:47:15Z" w:initials="CL">
     <w:p>
       <w:r>
         <w:rPr>
@@ -18618,7 +18618,7 @@
       </w:r>
     </w:p>
   </w:comment>
-  <w:comment w:id="1" w:author="Claude" w:date="2026-10-23T22:44:35Z" w:initials="CL">
+  <w:comment w:id="1" w:author="Claude" w:date="2026-10-23T22:47:15Z" w:initials="CL">
     <w:p>
       <w:r>
         <w:rPr>
@@ -18636,7 +18636,7 @@
       </w:r>
     </w:p>
   </w:comment>
-  <w:comment w:id="2" w:author="Claude" w:date="2026-10-23T22:44:35Z" w:initials="CL">
+  <w:comment w:id="2" w:author="Claude" w:date="2026-10-23T22:47:16Z" w:initials="CL">
     <w:p>
       <w:r>
         <w:rPr>
@@ -18654,7 +18654,7 @@
       </w:r>
     </w:p>
   </w:comment>
-  <w:comment w:id="3" w:author="Claude" w:date="2026-10-23T22:44:35Z" w:initials="CL">
+  <w:comment w:id="3" w:author="Claude" w:date="2026-10-23T22:47:16Z" w:initials="CL">
     <w:p>
       <w:r>
         <w:rPr>
@@ -18672,7 +18672,7 @@
       </w:r>
     </w:p>
   </w:comment>
-  <w:comment w:id="4" w:author="Claude" w:date="2026-10-23T22:44:36Z" w:initials="CL">
+  <w:comment w:id="4" w:author="Claude" w:date="2026-10-23T22:47:16Z" w:initials="CL">
     <w:p>
       <w:r>
         <w:rPr>
@@ -18695,31 +18695,31 @@
 
 <file path=word/commentsExtended.xml><?xml version="1.0" encoding="utf-8"?>
 <w15:commentsEx xmlns:wpc="http://schemas.microsoft.com/office/word/2010/wordprocessingCanvas" xmlns:cx="http://schemas.microsoft.com/office/drawing/2014/chartex" xmlns:cx1="http://schemas.microsoft.com/office/drawing/2015/9/8/chartex" xmlns:cx2="http://schemas.microsoft.com/office/drawing/2015/10/21/chartex" xmlns:cx3="http://schemas.microsoft.com/office/drawing/2016/5/9/chartex" xmlns:cx4="http://schemas.microsoft.com/office/drawing/2016/5/10/chartex" xmlns:cx5="http://schemas.microsoft.com/office/drawing/2016/5/11/chartex" xmlns:cx6="http://schemas.microsoft.com/office/drawing/2016/5/12/chartex" xmlns:cx7="http://schemas.microsoft.com/office/drawing/2016/5/13/chartex" xmlns:cx8="http://schemas.microsoft.com/office/drawing/2016/5/14/chartex" xmlns:mc="http://schemas.openxmlformats.org/markup-compatibility/2006" xmlns:aink="http://schemas.microsoft.com/office/drawing/2016/ink" xmlns:am3d="http://schemas.microsoft.com/office/drawing/2017/model3d" xmlns:o="urn:schemas-microsoft-com:office:office" xmlns:oel="http://schemas.microsoft.com/office/2019/extlst" xmlns:r="http://schemas.openxmlformats.org/officeDocument/2006/relationships" xmlns:m="http://schemas.openxmlformats.org/officeDocument/2006/math" xmlns:v="urn:schemas-microsoft-com:vml" xmlns:wp14="http://schemas.microsoft.com/office/word/2010/wordprocessingDrawing" xmlns:wp="http://schemas.openxmlformats.org/drawingml/2006/wordprocessingDrawing" xmlns:w10="urn:schemas-microsoft-com:office:word" xmlns:w="http://schemas.openxmlformats.org/wordprocessingml/2006/main" xmlns:w14="http://schemas.microsoft.com/office/word/2010/wordml" xmlns:w15="http://schemas.microsoft.com/office/word/2012/wordml" xmlns:w16cex="http://schemas.microsoft.com/office/word/2018/wordml/cex" xmlns:w16cid="http://schemas.microsoft.com/office/word/2016/wordml/cid" xmlns:w16="http://schemas.microsoft.com/office/word/2018/wordml" xmlns:w16du="http://schemas.microsoft.com/office/word/2023/wordml/word16du" xmlns:w16sdtdh="http://schemas.microsoft.com/office/word/2020/wordml/sdtdatahash" xmlns:w16sdtfl="http://schemas.microsoft.com/office/word/2024/wordml/sdtformatlock" xmlns:w16se="http://schemas.microsoft.com/office/word/2015/wordml/symex" xmlns:wpg="http://schemas.microsoft.com/office/word/2010/wordprocessingGroup" xmlns:wpi="http://schemas.microsoft.com/office/word/2010/wordprocessingInk" xmlns:wne="http://schemas.microsoft.com/office/word/2006/wordml" xmlns:wps="http://schemas.microsoft.com/office/word/2010/wordprocessingShape" mc:Ignorable="w14 w15 w16se w16cid w16 w16cex w16sdtdh w16sdtfl w16du wp14">
-  <w15:commentEx w15:paraId="683AD744" w15:done="0"/>
-  <w15:commentEx w15:paraId="35FFF66C" w15:done="0"/>
-  <w15:commentEx w15:paraId="7B052B7B" w15:done="0"/>
-  <w15:commentEx w15:paraId="7F9C8DC9" w15:done="0"/>
-  <w15:commentEx w15:paraId="0EBFA77D" w15:done="0"/>
+  <w15:commentEx w15:paraId="086DDFE3" w15:done="0"/>
+  <w15:commentEx w15:paraId="6AACE6B4" w15:done="0"/>
+  <w15:commentEx w15:paraId="2F273B4C" w15:done="0"/>
+  <w15:commentEx w15:paraId="39236FD6" w15:done="0"/>
+  <w15:commentEx w15:paraId="67282910" w15:done="0"/>
 </w15:commentsEx>
 </file>
 
 <file path=word/commentsExtensible.xml><?xml version="1.0" encoding="utf-8"?>
 <w16cex:commentsExtensible xmlns:wpc="http://schemas.microsoft.com/office/word/2010/wordprocessingCanvas" xmlns:cx="http://schemas.microsoft.com/office/drawing/2014/chartex" xmlns:cx1="http://schemas.microsoft.com/office/drawing/2015/9/8/chartex" xmlns:cx2="http://schemas.microsoft.com/office/drawing/2015/10/21/chartex" xmlns:cx3="http://schemas.microsoft.com/office/drawing/2016/5/9/chartex" xmlns:cx4="http://schemas.microsoft.com/office/drawing/2016/5/10/chartex" xmlns:cx5="http://schemas.microsoft.com/office/drawing/2016/5/11/chartex" xmlns:cx6="http://schemas.microsoft.com/office/drawing/2016/5/12/chartex" xmlns:cx7="http://schemas.microsoft.com/office/drawing/2016/5/13/chartex" xmlns:cx8="http://schemas.microsoft.com/office/drawing/2016/5/14/chartex" xmlns:mc="http://schemas.openxmlformats.org/markup-compatibility/2006" xmlns:aink="http://schemas.microsoft.com/office/drawing/2016/ink" xmlns:am3d="http://schemas.microsoft.com/office/drawing/2017/model3d" xmlns:o="urn:schemas-microsoft-com:office:office" xmlns:oel="http://schemas.microsoft.com/office/2019/extlst" xmlns:r="http://schemas.openxmlformats.org/officeDocument/2006/relationships" xmlns:m="http://schemas.openxmlformats.org/officeDocument/2006/math" xmlns:v="urn:schemas-microsoft-com:vml" xmlns:wp14="http://schemas.microsoft.com/office/word/2010/wordprocessingDrawing" xmlns:wp="http://schemas.openxmlformats.org/drawingml/2006/wordprocessingDrawing" xmlns:w10="urn:schemas-microsoft-com:office:word" xmlns:w="http://schemas.openxmlformats.org/wordprocessingml/2006/main" xmlns:w14="http://schemas.microsoft.com/office/word/2010/wordml" xmlns:w15="http://schemas.microsoft.com/office/word/2012/wordml" xmlns:w16cex="http://schemas.microsoft.com/office/word/2018/wordml/cex" xmlns:w16cid="http://schemas.microsoft.com/office/word/2016/wordml/cid" xmlns:w16="http://schemas.microsoft.com/office/word/2018/wordml" xmlns:w16du="http://schemas.microsoft.com/office/word/2023/wordml/word16du" xmlns:w16sdtdh="http://schemas.microsoft.com/office/word/2020/wordml/sdtdatahash" xmlns:w16sdtfl="http://schemas.microsoft.com/office/word/2024/wordml/sdtformatlock" xmlns:w16se="http://schemas.microsoft.com/office/word/2015/wordml/symex" xmlns:wpg="http://schemas.microsoft.com/office/word/2010/wordprocessingGroup" xmlns:wpi="http://schemas.microsoft.com/office/word/2010/wordprocessingInk" xmlns:wne="http://schemas.microsoft.com/office/word/2006/wordml" xmlns:wps="http://schemas.microsoft.com/office/word/2010/wordprocessingShape" xmlns:cr="http://schemas.microsoft.com/office/comments/2020/reactions" mc:Ignorable="w14 w15 w16se w16cid w16 w16cex w16sdtdh w16sdtfl cr w16du wp14">
-  <w16cex:commentExtensible w16cex:durableId="6B082DB8" w16cex:dateUtc="2026-10-23T22:44:34Z"/>
-  <w16cex:commentExtensible w16cex:durableId="4F1EF6B8" w16cex:dateUtc="2026-10-23T22:44:35Z"/>
-  <w16cex:commentExtensible w16cex:durableId="1DF05143" w16cex:dateUtc="2026-10-23T22:44:35Z"/>
-  <w16cex:commentExtensible w16cex:durableId="33BEE7D8" w16cex:dateUtc="2026-10-23T22:44:35Z"/>
-  <w16cex:commentExtensible w16cex:durableId="321A7ACD" w16cex:dateUtc="2026-10-23T22:44:36Z"/>
+  <w16cex:commentExtensible w16cex:durableId="7F819E33" w16cex:dateUtc="2026-10-23T22:47:15Z"/>
+  <w16cex:commentExtensible w16cex:durableId="74F74EFE" w16cex:dateUtc="2026-10-23T22:47:15Z"/>
+  <w16cex:commentExtensible w16cex:durableId="612F2984" w16cex:dateUtc="2026-10-23T22:47:16Z"/>
+  <w16cex:commentExtensible w16cex:durableId="2921F5F3" w16cex:dateUtc="2026-10-23T22:47:16Z"/>
+  <w16cex:commentExtensible w16cex:durableId="6FEDEC4D" w16cex:dateUtc="2026-10-23T22:47:16Z"/>
 </w16cex:commentsExtensible>
 </file>
 
 <file path=word/commentsIds.xml><?xml version="1.0" encoding="utf-8"?>
 <w16cid:commentsIds xmlns:wpc="http://schemas.microsoft.com/office/word/2010/wordprocessingCanvas" xmlns:cx="http://schemas.microsoft.com/office/drawing/2014/chartex" xmlns:cx1="http://schemas.microsoft.com/office/drawing/2015/9/8/chartex" xmlns:cx2="http://schemas.microsoft.com/office/drawing/2015/10/21/chartex" xmlns:cx3="http://schemas.microsoft.com/office/drawing/2016/5/9/chartex" xmlns:cx4="http://schemas.microsoft.com/office/drawing/2016/5/10/chartex" xmlns:cx5="http://schemas.microsoft.com/office/drawing/2016/5/11/chartex" xmlns:cx6="http://schemas.microsoft.com/office/drawing/2016/5/12/chartex" xmlns:cx7="http://schemas.microsoft.com/office/drawing/2016/5/13/chartex" xmlns:cx8="http://schemas.microsoft.com/office/drawing/2016/5/14/chartex" xmlns:mc="http://schemas.openxmlformats.org/markup-compatibility/2006" xmlns:aink="http://schemas.microsoft.com/office/drawing/2016/ink" xmlns:am3d="http://schemas.microsoft.com/office/drawing/2017/model3d" xmlns:o="urn:schemas-microsoft-com:office:office" xmlns:oel="http://schemas.microsoft.com/office/2019/extlst" xmlns:r="http://schemas.openxmlformats.org/officeDocument/2006/relationships" xmlns:m="http://schemas.openxmlformats.org/officeDocument/2006/math" xmlns:v="urn:schemas-microsoft-com:vml" xmlns:wp14="http://schemas.microsoft.com/office/word/2010/wordprocessingDrawing" xmlns:wp="http://schemas.openxmlformats.org/drawingml/2006/wordprocessingDrawing" xmlns:w10="urn:schemas-microsoft-com:office:word" xmlns:w="http://schemas.openxmlformats.org/wordprocessingml/2006/main" xmlns:w14="http://schemas.microsoft.com/office/word/2010/wordml" xmlns:w15="http://schemas.microsoft.com/office/word/2012/wordml" xmlns:w16cex="http://schemas.microsoft.com/office/word/2018/wordml/cex" xmlns:w16cid="http://schemas.microsoft.com/office/word/2016/wordml/cid" xmlns:w16="http://schemas.microsoft.com/office/word/2018/wordml" xmlns:w16du="http://schemas.microsoft.com/office/word/2023/wordml/word16du" xmlns:w16sdtdh="http://schemas.microsoft.com/office/word/2020/wordml/sdtdatahash" xmlns:w16sdtfl="http://schemas.microsoft.com/office/word/2024/wordml/sdtformatlock" xmlns:w16se="http://schemas.microsoft.com/office/word/2015/wordml/symex" xmlns:wpg="http://schemas.microsoft.com/office/word/2010/wordprocessingGroup" xmlns:wpi="http://schemas.microsoft.com/office/word/2010/wordprocessingInk" xmlns:wne="http://schemas.microsoft.com/office/word/2006/wordml" xmlns:wps="http://schemas.microsoft.com/office/word/2010/wordprocessingShape" mc:Ignorable="w14 w15 w16se w16cid w16 w16cex w16sdtdh w16sdtfl w16du wp14">
-  <w16cid:commentId w16cid:paraId="683AD744" w16cid:durableId="6B082DB8"/>
-  <w16cid:commentId w16cid:paraId="35FFF66C" w16cid:durableId="4F1EF6B8"/>
-  <w16cid:commentId w16cid:paraId="7B052B7B" w16cid:durableId="1DF05143"/>
-  <w16cid:commentId w16cid:paraId="7F9C8DC9" w16cid:durableId="33BEE7D8"/>
-  <w16cid:commentId w16cid:paraId="0EBFA77D" w16cid:durableId="321A7ACD"/>
+  <w16cid:commentId w16cid:paraId="086DDFE3" w16cid:durableId="7F819E33"/>
+  <w16cid:commentId w16cid:paraId="6AACE6B4" w16cid:durableId="74F74EFE"/>
+  <w16cid:commentId w16cid:paraId="2F273B4C" w16cid:durableId="612F2984"/>
+  <w16cid:commentId w16cid:paraId="39236FD6" w16cid:durableId="2921F5F3"/>
+  <w16cid:commentId w16cid:paraId="67282910" w16cid:durableId="6FEDEC4D"/>
 </w16cid:commentsIds>
 </file>
 

</xml_diff>